<commit_message>
Close out the Kenan role across the CV and both pages
The ArabsStock contract ended on 1 October 2026. Everything that said the
role was current now says when it finished, and the summary moves from 'I
own' to 'I owned' so no reader is left with the wrong tense.

Added 'Available immediately for remote or on-site roles' to the summary and
'available immediately' to the terminal status line. Being free to start is
worth stating plainly: recruiters filter on it, and it is the one thing that
is true today and was not true last week.

Eight places carried 'Present' or 'now' — the CV, the terminal's neofetch,
projects, experience.txt and about.txt, and three date columns on about.html.
All checked, none left. Re-ran the ATS battery after the edit: 2 pages, 654
words, 18 bullets intact, 6 date ranges parsing, keyword coverage holding.

Co-Authored-By: Claude Opus 5 (1M context) <noreply@anthropic.com>
</commit_message>
<xml_diff>
--- a/Ibrahim-Madi-CV.docx
+++ b/Ibrahim-Madi-CV.docx
@@ -86,7 +86,7 @@
       </w:pPr>
       <w:r>
         <w:rPr/>
-        <w:t>Full stack developer with 9 years building production web platforms, 7 of them on Laravel. Core developer on ArabsStock, an Arabic stock media marketplace holding over 1 million assets, where I own full-text and faceted search in Elasticsearch, the contributor ingest pipeline, and the RabbitMQ queues behind both. Strong across the stack — Vue.js and Nuxt.js on the front end, PHP, Python, MySQL, Redis, Docker and Kubernetes behind it — working to OOP and SOLID principles, writing PHPUnit tests, reviewing pull requests and documenting what I ship.</w:t>
+        <w:t>Full stack developer with 9 years building production web platforms, 7 of them on Laravel. Spent five years as a core developer on ArabsStock, an Arabic stock media marketplace holding over 1 million assets, where I owned full-text and faceted search in Elasticsearch, the contributor ingest pipeline, and the RabbitMQ queues behind both. Strong across the stack — Vue.js and Nuxt.js on the front end, PHP, Python, MySQL, Redis, Docker and Kubernetes behind it — working to OOP and SOLID principles, writing PHPUnit tests, reviewing pull requests and documenting what I ship. Available immediately for remote or on-site roles.</w:t>
       </w:r>
     </w:p>
     <w:p>
@@ -334,7 +334,7 @@
       </w:pPr>
       <w:r>
         <w:rPr/>
-        <w:t>Kenan Technology | Gaza, Palestine | January 2021 – Present</w:t>
+        <w:t>Kenan Technology | Gaza, Palestine | January 2021 – October 2026</w:t>
       </w:r>
     </w:p>
     <w:p>

</xml_diff>